<commit_message>
v260519 (unnecessary bookmark deleted)
</commit_message>
<xml_diff>
--- a/【西宮】同意書・説明書雛形_NoPlaceHolder.docx
+++ b/【西宮】同意書・説明書雛形_NoPlaceHolder.docx
@@ -2256,7 +2256,6 @@
         </w:rPr>
         <w:tab/>
       </w:r>
-      <w:bookmarkStart w:id="0" w:name="OLE_LINK1"/>
       <w:r>
         <w:rPr>
           <w:rFonts w:ascii="ＭＳ ゴシック" w:eastAsia="ＭＳ ゴシック" w:hAnsi="ＭＳ ゴシック"/>
@@ -2283,7 +2282,6 @@
         </w:rPr>
         <w:t xml:space="preserve">]] </w:t>
       </w:r>
-      <w:bookmarkEnd w:id="0"/>
       <w:r>
         <w:rPr>
           <w:rFonts w:asciiTheme="majorEastAsia" w:eastAsiaTheme="majorEastAsia" w:hAnsiTheme="majorEastAsia" w:hint="eastAsia"/>
@@ -8693,6 +8691,29 @@
     <w:pPr>
       <w:ind w:leftChars="400" w:left="840"/>
     </w:pPr>
+  </w:style>
+  <w:style w:type="character" w:styleId="ac">
+    <w:name w:val="Hyperlink"/>
+    <w:basedOn w:val="a0"/>
+    <w:uiPriority w:val="99"/>
+    <w:unhideWhenUsed/>
+    <w:rsid w:val="0092490D"/>
+    <w:rPr>
+      <w:color w:val="0000FF" w:themeColor="hyperlink"/>
+      <w:u w:val="single"/>
+    </w:rPr>
+  </w:style>
+  <w:style w:type="character" w:styleId="ad">
+    <w:name w:val="Unresolved Mention"/>
+    <w:basedOn w:val="a0"/>
+    <w:uiPriority w:val="99"/>
+    <w:semiHidden/>
+    <w:unhideWhenUsed/>
+    <w:rsid w:val="0092490D"/>
+    <w:rPr>
+      <w:color w:val="605E5C"/>
+      <w:shd w:val="clear" w:color="auto" w:fill="E1DFDD"/>
+    </w:rPr>
   </w:style>
 </w:styles>
 </file>
@@ -9562,6 +9583,7 @@
     <w:rsid w:val="00623B8D"/>
     <w:rsid w:val="006446DB"/>
     <w:rsid w:val="00650C9B"/>
+    <w:rsid w:val="00667106"/>
     <w:rsid w:val="006817E3"/>
     <w:rsid w:val="00684DC1"/>
     <w:rsid w:val="00686EF2"/>
@@ -9625,6 +9647,7 @@
     <w:rsid w:val="00CF6C02"/>
     <w:rsid w:val="00D04C2C"/>
     <w:rsid w:val="00D70A99"/>
+    <w:rsid w:val="00D81E3D"/>
     <w:rsid w:val="00D935CE"/>
     <w:rsid w:val="00DB54EA"/>
     <w:rsid w:val="00E014DC"/>

</xml_diff>